<commit_message>
Keep WHO-5 and PHQ-4 editable A4 answer sheet tables inside printable width
</commit_message>
<xml_diff>
--- a/downloads/phq4_answers.docx
+++ b/downloads/phq4_answers.docx
@@ -41,7 +41,7 @@
     </w:p>
     <w:tbl>
       <w:tblPr>
-        <w:tblW w:w="10550" w:type="dxa"/>
+        <w:tblW w:w="10200" w:type="dxa"/>
         <w:tblLayout w:type="fixed"/>
         <w:tblBorders>
           <w:top w:val="single" w:sz="5" w:color="9DAFA2"/>
@@ -53,11 +53,11 @@
         </w:tblBorders>
       </w:tblPr>
       <w:tblGrid>
-        <w:gridCol w:w="1150"/>
-        <w:gridCol w:w="2350"/>
-        <w:gridCol w:w="2350"/>
-        <w:gridCol w:w="2350"/>
-        <w:gridCol w:w="2350"/>
+        <w:gridCol w:w="1020"/>
+        <w:gridCol w:w="2295"/>
+        <w:gridCol w:w="2295"/>
+        <w:gridCol w:w="2295"/>
+        <w:gridCol w:w="2295"/>
       </w:tblGrid>
       <w:tr>
         <w:trPr>
@@ -66,7 +66,7 @@
         </w:trPr>
         <w:tc>
           <w:tcPr>
-            <w:tcW w:w="1150" w:type="dxa"/>
+            <w:tcW w:w="1020" w:type="dxa"/>
             <w:shd w:fill="E8F1E9"/>
             <w:vAlign w:val="center"/>
           </w:tcPr>
@@ -87,7 +87,7 @@
         </w:tc>
         <w:tc>
           <w:tcPr>
-            <w:tcW w:w="2350" w:type="dxa"/>
+            <w:tcW w:w="2295" w:type="dxa"/>
             <w:shd w:fill="E8F1E9"/>
             <w:vAlign w:val="center"/>
           </w:tcPr>
@@ -108,7 +108,7 @@
         </w:tc>
         <w:tc>
           <w:tcPr>
-            <w:tcW w:w="2350" w:type="dxa"/>
+            <w:tcW w:w="2295" w:type="dxa"/>
             <w:shd w:fill="E8F1E9"/>
             <w:vAlign w:val="center"/>
           </w:tcPr>
@@ -129,7 +129,7 @@
         </w:tc>
         <w:tc>
           <w:tcPr>
-            <w:tcW w:w="2350" w:type="dxa"/>
+            <w:tcW w:w="2295" w:type="dxa"/>
             <w:shd w:fill="E8F1E9"/>
             <w:vAlign w:val="center"/>
           </w:tcPr>
@@ -150,7 +150,7 @@
         </w:tc>
         <w:tc>
           <w:tcPr>
-            <w:tcW w:w="2350" w:type="dxa"/>
+            <w:tcW w:w="2295" w:type="dxa"/>
             <w:shd w:fill="E8F1E9"/>
             <w:vAlign w:val="center"/>
           </w:tcPr>
@@ -176,7 +176,7 @@
         </w:trPr>
         <w:tc>
           <w:tcPr>
-            <w:tcW w:w="1150" w:type="dxa"/>
+            <w:tcW w:w="1020" w:type="dxa"/>
             <w:vAlign w:val="center"/>
           </w:tcPr>
           <w:p>
@@ -195,43 +195,43 @@
         </w:tc>
         <w:tc>
           <w:tcPr>
-            <w:tcW w:w="2350" w:type="dxa"/>
-            <w:vAlign w:val="center"/>
-          </w:tcPr>
-          <w:p>
-            <w:pPr>
-              <w:jc w:val="center"/>
-              <w:spacing w:after="0"/>
-            </w:pPr>
-          </w:p>
-        </w:tc>
-        <w:tc>
-          <w:tcPr>
-            <w:tcW w:w="2350" w:type="dxa"/>
-            <w:vAlign w:val="center"/>
-          </w:tcPr>
-          <w:p>
-            <w:pPr>
-              <w:jc w:val="center"/>
-              <w:spacing w:after="0"/>
-            </w:pPr>
-          </w:p>
-        </w:tc>
-        <w:tc>
-          <w:tcPr>
-            <w:tcW w:w="2350" w:type="dxa"/>
-            <w:vAlign w:val="center"/>
-          </w:tcPr>
-          <w:p>
-            <w:pPr>
-              <w:jc w:val="center"/>
-              <w:spacing w:after="0"/>
-            </w:pPr>
-          </w:p>
-        </w:tc>
-        <w:tc>
-          <w:tcPr>
-            <w:tcW w:w="2350" w:type="dxa"/>
+            <w:tcW w:w="2295" w:type="dxa"/>
+            <w:vAlign w:val="center"/>
+          </w:tcPr>
+          <w:p>
+            <w:pPr>
+              <w:jc w:val="center"/>
+              <w:spacing w:after="0"/>
+            </w:pPr>
+          </w:p>
+        </w:tc>
+        <w:tc>
+          <w:tcPr>
+            <w:tcW w:w="2295" w:type="dxa"/>
+            <w:vAlign w:val="center"/>
+          </w:tcPr>
+          <w:p>
+            <w:pPr>
+              <w:jc w:val="center"/>
+              <w:spacing w:after="0"/>
+            </w:pPr>
+          </w:p>
+        </w:tc>
+        <w:tc>
+          <w:tcPr>
+            <w:tcW w:w="2295" w:type="dxa"/>
+            <w:vAlign w:val="center"/>
+          </w:tcPr>
+          <w:p>
+            <w:pPr>
+              <w:jc w:val="center"/>
+              <w:spacing w:after="0"/>
+            </w:pPr>
+          </w:p>
+        </w:tc>
+        <w:tc>
+          <w:tcPr>
+            <w:tcW w:w="2295" w:type="dxa"/>
             <w:vAlign w:val="center"/>
           </w:tcPr>
           <w:p>
@@ -248,7 +248,7 @@
         </w:trPr>
         <w:tc>
           <w:tcPr>
-            <w:tcW w:w="1150" w:type="dxa"/>
+            <w:tcW w:w="1020" w:type="dxa"/>
             <w:vAlign w:val="center"/>
           </w:tcPr>
           <w:p>
@@ -267,43 +267,43 @@
         </w:tc>
         <w:tc>
           <w:tcPr>
-            <w:tcW w:w="2350" w:type="dxa"/>
-            <w:vAlign w:val="center"/>
-          </w:tcPr>
-          <w:p>
-            <w:pPr>
-              <w:jc w:val="center"/>
-              <w:spacing w:after="0"/>
-            </w:pPr>
-          </w:p>
-        </w:tc>
-        <w:tc>
-          <w:tcPr>
-            <w:tcW w:w="2350" w:type="dxa"/>
-            <w:vAlign w:val="center"/>
-          </w:tcPr>
-          <w:p>
-            <w:pPr>
-              <w:jc w:val="center"/>
-              <w:spacing w:after="0"/>
-            </w:pPr>
-          </w:p>
-        </w:tc>
-        <w:tc>
-          <w:tcPr>
-            <w:tcW w:w="2350" w:type="dxa"/>
-            <w:vAlign w:val="center"/>
-          </w:tcPr>
-          <w:p>
-            <w:pPr>
-              <w:jc w:val="center"/>
-              <w:spacing w:after="0"/>
-            </w:pPr>
-          </w:p>
-        </w:tc>
-        <w:tc>
-          <w:tcPr>
-            <w:tcW w:w="2350" w:type="dxa"/>
+            <w:tcW w:w="2295" w:type="dxa"/>
+            <w:vAlign w:val="center"/>
+          </w:tcPr>
+          <w:p>
+            <w:pPr>
+              <w:jc w:val="center"/>
+              <w:spacing w:after="0"/>
+            </w:pPr>
+          </w:p>
+        </w:tc>
+        <w:tc>
+          <w:tcPr>
+            <w:tcW w:w="2295" w:type="dxa"/>
+            <w:vAlign w:val="center"/>
+          </w:tcPr>
+          <w:p>
+            <w:pPr>
+              <w:jc w:val="center"/>
+              <w:spacing w:after="0"/>
+            </w:pPr>
+          </w:p>
+        </w:tc>
+        <w:tc>
+          <w:tcPr>
+            <w:tcW w:w="2295" w:type="dxa"/>
+            <w:vAlign w:val="center"/>
+          </w:tcPr>
+          <w:p>
+            <w:pPr>
+              <w:jc w:val="center"/>
+              <w:spacing w:after="0"/>
+            </w:pPr>
+          </w:p>
+        </w:tc>
+        <w:tc>
+          <w:tcPr>
+            <w:tcW w:w="2295" w:type="dxa"/>
             <w:vAlign w:val="center"/>
           </w:tcPr>
           <w:p>
@@ -320,7 +320,7 @@
         </w:trPr>
         <w:tc>
           <w:tcPr>
-            <w:tcW w:w="1150" w:type="dxa"/>
+            <w:tcW w:w="1020" w:type="dxa"/>
             <w:vAlign w:val="center"/>
           </w:tcPr>
           <w:p>
@@ -339,43 +339,43 @@
         </w:tc>
         <w:tc>
           <w:tcPr>
-            <w:tcW w:w="2350" w:type="dxa"/>
-            <w:vAlign w:val="center"/>
-          </w:tcPr>
-          <w:p>
-            <w:pPr>
-              <w:jc w:val="center"/>
-              <w:spacing w:after="0"/>
-            </w:pPr>
-          </w:p>
-        </w:tc>
-        <w:tc>
-          <w:tcPr>
-            <w:tcW w:w="2350" w:type="dxa"/>
-            <w:vAlign w:val="center"/>
-          </w:tcPr>
-          <w:p>
-            <w:pPr>
-              <w:jc w:val="center"/>
-              <w:spacing w:after="0"/>
-            </w:pPr>
-          </w:p>
-        </w:tc>
-        <w:tc>
-          <w:tcPr>
-            <w:tcW w:w="2350" w:type="dxa"/>
-            <w:vAlign w:val="center"/>
-          </w:tcPr>
-          <w:p>
-            <w:pPr>
-              <w:jc w:val="center"/>
-              <w:spacing w:after="0"/>
-            </w:pPr>
-          </w:p>
-        </w:tc>
-        <w:tc>
-          <w:tcPr>
-            <w:tcW w:w="2350" w:type="dxa"/>
+            <w:tcW w:w="2295" w:type="dxa"/>
+            <w:vAlign w:val="center"/>
+          </w:tcPr>
+          <w:p>
+            <w:pPr>
+              <w:jc w:val="center"/>
+              <w:spacing w:after="0"/>
+            </w:pPr>
+          </w:p>
+        </w:tc>
+        <w:tc>
+          <w:tcPr>
+            <w:tcW w:w="2295" w:type="dxa"/>
+            <w:vAlign w:val="center"/>
+          </w:tcPr>
+          <w:p>
+            <w:pPr>
+              <w:jc w:val="center"/>
+              <w:spacing w:after="0"/>
+            </w:pPr>
+          </w:p>
+        </w:tc>
+        <w:tc>
+          <w:tcPr>
+            <w:tcW w:w="2295" w:type="dxa"/>
+            <w:vAlign w:val="center"/>
+          </w:tcPr>
+          <w:p>
+            <w:pPr>
+              <w:jc w:val="center"/>
+              <w:spacing w:after="0"/>
+            </w:pPr>
+          </w:p>
+        </w:tc>
+        <w:tc>
+          <w:tcPr>
+            <w:tcW w:w="2295" w:type="dxa"/>
             <w:vAlign w:val="center"/>
           </w:tcPr>
           <w:p>
@@ -392,7 +392,7 @@
         </w:trPr>
         <w:tc>
           <w:tcPr>
-            <w:tcW w:w="1150" w:type="dxa"/>
+            <w:tcW w:w="1020" w:type="dxa"/>
             <w:vAlign w:val="center"/>
           </w:tcPr>
           <w:p>
@@ -411,43 +411,43 @@
         </w:tc>
         <w:tc>
           <w:tcPr>
-            <w:tcW w:w="2350" w:type="dxa"/>
-            <w:vAlign w:val="center"/>
-          </w:tcPr>
-          <w:p>
-            <w:pPr>
-              <w:jc w:val="center"/>
-              <w:spacing w:after="0"/>
-            </w:pPr>
-          </w:p>
-        </w:tc>
-        <w:tc>
-          <w:tcPr>
-            <w:tcW w:w="2350" w:type="dxa"/>
-            <w:vAlign w:val="center"/>
-          </w:tcPr>
-          <w:p>
-            <w:pPr>
-              <w:jc w:val="center"/>
-              <w:spacing w:after="0"/>
-            </w:pPr>
-          </w:p>
-        </w:tc>
-        <w:tc>
-          <w:tcPr>
-            <w:tcW w:w="2350" w:type="dxa"/>
-            <w:vAlign w:val="center"/>
-          </w:tcPr>
-          <w:p>
-            <w:pPr>
-              <w:jc w:val="center"/>
-              <w:spacing w:after="0"/>
-            </w:pPr>
-          </w:p>
-        </w:tc>
-        <w:tc>
-          <w:tcPr>
-            <w:tcW w:w="2350" w:type="dxa"/>
+            <w:tcW w:w="2295" w:type="dxa"/>
+            <w:vAlign w:val="center"/>
+          </w:tcPr>
+          <w:p>
+            <w:pPr>
+              <w:jc w:val="center"/>
+              <w:spacing w:after="0"/>
+            </w:pPr>
+          </w:p>
+        </w:tc>
+        <w:tc>
+          <w:tcPr>
+            <w:tcW w:w="2295" w:type="dxa"/>
+            <w:vAlign w:val="center"/>
+          </w:tcPr>
+          <w:p>
+            <w:pPr>
+              <w:jc w:val="center"/>
+              <w:spacing w:after="0"/>
+            </w:pPr>
+          </w:p>
+        </w:tc>
+        <w:tc>
+          <w:tcPr>
+            <w:tcW w:w="2295" w:type="dxa"/>
+            <w:vAlign w:val="center"/>
+          </w:tcPr>
+          <w:p>
+            <w:pPr>
+              <w:jc w:val="center"/>
+              <w:spacing w:after="0"/>
+            </w:pPr>
+          </w:p>
+        </w:tc>
+        <w:tc>
+          <w:tcPr>
+            <w:tcW w:w="2295" w:type="dxa"/>
             <w:vAlign w:val="center"/>
           </w:tcPr>
           <w:p>

</xml_diff>